<commit_message>
Study notes module, phone OTP login, screen-secure/copy-guard, policy page & PDF downloads
Co-Authored-By: Claude Opus 4.8 (1M context) <noreply@anthropic.com>
</commit_message>
<xml_diff>
--- a/tnpsc-mentor/legal/TNPSC_Mentor_Terms_and_Conditions.docx
+++ b/tnpsc-mentor/legal/TNPSC_Mentor_Terms_and_Conditions.docx
@@ -724,55 +724,61 @@
         <w:t>Refunds.</w:t>
       </w:r>
       <w:r>
-        <w:t xml:space="preserve"> </w:t>
-      </w:r>
-      <w:r>
-        <w:rPr>
-          <w:rFonts w:ascii="Consolas" w:hAnsi="Consolas"/>
-          <w:color w:val="993300"/>
-        </w:rPr>
-        <w:t>[State your refund policy clearly — required for compliance.]</w:t>
+        <w:t xml:space="preserve"> Premium grants immediate access to digital content. You may</w:t>
       </w:r>
     </w:p>
     <w:p>
       <w:r>
-        <w:t>For example: *Premium grants immediate access to digital content and is</w:t>
-      </w:r>
-    </w:p>
-    <w:p>
-      <w:r>
-        <w:t>generally non-refundable once activated, except where required by applicable</w:t>
-      </w:r>
-    </w:p>
-    <w:p>
-      <w:r>
-        <w:t>law or in case of a duplicate/failed-but-charged transaction, which will be</w:t>
-      </w:r>
-    </w:p>
-    <w:p>
-      <w:r>
-        <w:t xml:space="preserve">reviewed and refunded to the original payment method within </w:t>
-      </w:r>
-      <w:r>
-        <w:rPr>
-          <w:rFonts w:ascii="Consolas" w:hAnsi="Consolas"/>
-          <w:color w:val="993300"/>
-        </w:rPr>
-        <w:t>[X]</w:t>
-      </w:r>
-      <w:r>
-        <w:t xml:space="preserve"> business</w:t>
-      </w:r>
-    </w:p>
-    <w:p>
-      <w:r>
-        <w:t xml:space="preserve">days.* Refund requests: </w:t>
+        <w:t xml:space="preserve">request a refund within </w:t>
       </w:r>
       <w:r>
         <w:rPr>
           <w:b/>
         </w:rPr>
-        <w:t>[support@sirahdigital.in]</w:t>
+        <w:t>48 hours</w:t>
+      </w:r>
+      <w:r>
+        <w:t xml:space="preserve"> of the purchase (payment) time; eligible</w:t>
+      </w:r>
+    </w:p>
+    <w:p>
+      <w:r>
+        <w:t>requests are refunded in full to the original payment method. After this</w:t>
+      </w:r>
+    </w:p>
+    <w:p>
+      <w:r>
+        <w:t>48-hour window the purchase is non-refundable, except where required by</w:t>
+      </w:r>
+    </w:p>
+    <w:p>
+      <w:r>
+        <w:t>applicable law or in the case of a duplicate or failed-but-charged</w:t>
+      </w:r>
+    </w:p>
+    <w:p>
+      <w:r>
+        <w:t>transaction. Approved refunds are processed to the original payment method</w:t>
+      </w:r>
+    </w:p>
+    <w:p>
+      <w:r>
+        <w:t xml:space="preserve">within </w:t>
+      </w:r>
+      <w:r>
+        <w:rPr>
+          <w:b/>
+        </w:rPr>
+        <w:t>5–7 business days</w:t>
+      </w:r>
+      <w:r>
+        <w:t xml:space="preserve">. Refund requests: </w:t>
+      </w:r>
+      <w:r>
+        <w:rPr>
+          <w:b/>
+        </w:rPr>
+        <w:t>support@sirahdigital.in</w:t>
       </w:r>
       <w:r>
         <w:t>.</w:t>

</xml_diff>